<commit_message>
Add AnchorInsightOS architecture series AIN-100 through AIN-110
</commit_message>
<xml_diff>
--- a/docs/platform/knowledge/AIN-100 - AnchorInsight Architecture.docx
+++ b/docs/platform/knowledge/AIN-100 - AnchorInsight Architecture.docx
@@ -1998,8 +1998,8 @@
     </w:p>
     <w:p>
       <w:pPr>
-        <w:pBdr/>
-        <w:shd w:val="nil"/>
+        <w:pStyle w:val="713"/>
+        <w:pBdr/>
         <w:spacing/>
         <w:ind/>
         <w:rPr/>
@@ -2008,7 +2008,6 @@
         <w:rPr>
           <w:highlight w:val="none"/>
         </w:rPr>
-        <w:br w:type="page" w:clear="all"/>
       </w:r>
       <w:r>
         <w:rPr>
@@ -7550,38 +7549,11 @@
     </w:p>
     <w:p>
       <w:pPr>
-        <w:pBdr/>
-        <w:shd w:val="nil"/>
+        <w:pStyle w:val="713"/>
+        <w:pBdr/>
         <w:spacing/>
         <w:ind/>
         <w:rPr/>
-      </w:pPr>
-      <w:r>
-        <w:rPr>
-          <w:highlight w:val="none"/>
-        </w:rPr>
-        <w:br w:type="page" w:clear="all"/>
-      </w:r>
-      <w:r>
-        <w:rPr>
-          <w:highlight w:val="none"/>
-        </w:rPr>
-      </w:r>
-      <w:r>
-        <w:rPr>
-          <w:highlight w:val="none"/>
-        </w:rPr>
-      </w:r>
-    </w:p>
-    <w:p>
-      <w:pPr>
-        <w:pStyle w:val="713"/>
-        <w:pBdr/>
-        <w:spacing/>
-        <w:ind/>
-        <w:rPr>
-          <w:highlight w:val="none"/>
-        </w:rPr>
       </w:pPr>
       <w:r>
         <w:t xml:space="preserve">18. Nonfunctional Requirements</w:t>
@@ -9150,38 +9122,11 @@
     </w:p>
     <w:p>
       <w:pPr>
-        <w:pBdr/>
-        <w:shd w:val="nil"/>
+        <w:pStyle w:val="713"/>
+        <w:pBdr/>
         <w:spacing/>
         <w:ind/>
         <w:rPr/>
-      </w:pPr>
-      <w:r>
-        <w:rPr>
-          <w:highlight w:val="none"/>
-        </w:rPr>
-        <w:br w:type="page" w:clear="all"/>
-      </w:r>
-      <w:r>
-        <w:rPr>
-          <w:highlight w:val="none"/>
-        </w:rPr>
-      </w:r>
-      <w:r>
-        <w:rPr>
-          <w:highlight w:val="none"/>
-        </w:rPr>
-      </w:r>
-    </w:p>
-    <w:p>
-      <w:pPr>
-        <w:pStyle w:val="713"/>
-        <w:pBdr/>
-        <w:spacing/>
-        <w:ind/>
-        <w:rPr>
-          <w:highlight w:val="none"/>
-        </w:rPr>
       </w:pPr>
       <w:r>
         <w:t xml:space="preserve">21. Acceptance Criteria for the First Build</w:t>

</xml_diff>